<commit_message>
CL3 AT1: rework reliability for the Ledgerline Multi-AZ database limitation
Ledgerline is a legacy app, vendor-certified single-instance only, so its database
cannot be made Multi-AZ (the application tier can). Reliability = app-tier Multi-AZ
+ DB backup/PITR/cross-Region DR (Melbourne, data stays in Australia). The
cost-benefit case rejects replacing the accounting product as disproportionate for
a business-hours system.

- exemplar / approved design: reliability + cost-benefit reworked; KE answers updated
- assessor: prominent ASSESSOR FOCUS pushback note on the Part B presentation
  checklist (probe candidates who propose a Multi-AZ database); D2/D4 tightened
- regenerated AT1 assessor + exemplar .docx

Note: AT3 instruments and assessment_plan still reference the old DB-Multi-AZ
design; a follow-up commit will propagate the change.

Co-Authored-By: Claude Opus 4.8 (1M context) <noreply@anthropic.com>
</commit_message>
<xml_diff>
--- a/S1-CL3-Cloud-Infrastructure-Improvement/assessments/AT1/AT1-Design-Assessor.docx
+++ b/S1-CL3-Cloud-Infrastructure-Improvement/assessments/AT1/AT1-Design-Assessor.docx
@@ -1039,7 +1039,7 @@
           </w:tcPr>
           <w:p>
             <w:r>
-              <w:t>D2 — Options and confirmed decisions: identifies architectural options and patterns, assesses their benefits and differences against the current business needs, and confirms the design decisions.</w:t>
+              <w:t>D2 — Options and confirmed decisions: identifies architectural options and patterns, assesses their benefits and differences against the current business needs, and confirms the design decisions — including recognising that a Multi-AZ database is not available for Ledgerline (the discovered Multi-AZ limitation) and ruling it out with a cost-versus-benefit justification.</w:t>
             </w:r>
           </w:p>
         </w:tc>
@@ -1083,7 +1083,7 @@
           </w:tcPr>
           <w:p>
             <w:r>
-              <w:t>D4 — Improvement design: improves compute, storage, database and network across all four optimisation concerns into one integrated architecture (Multi-AZ reliability, elastic-on-demand scalability, in-place security hardening, proportionate cost optimisation).</w:t>
+              <w:t>D4 — Improvement design: improves compute, storage, database and network across all four optimisation concerns into one integrated architecture (application-tier Multi-AZ plus database backup/restore and cross-Region DR for reliability — the database itself cannot be Multi-AZ, a Ledgerline constraint; elastic-on-demand scalability; in-place security hardening; proportionate cost optimisation).</w:t>
             </w:r>
           </w:p>
         </w:tc>
@@ -1184,6 +1184,28 @@
           </w:tcPr>
           <w:p>
             <w:r/>
+          </w:p>
+        </w:tc>
+      </w:tr>
+      <w:tr>
+        <w:tc>
+          <w:tcPr>
+            <w:tcW w:type="dxa" w:w="8697"/>
+          </w:tcPr>
+          <w:p>
+            <w:r>
+              <w:t>ASSESSOR FOCUS — common error to probe. The database tier CANNOT be made Multi-AZ: Ledgerline is vendor-certified single-instance only (the Multi-AZ database limitation discovered during the cloud migration — see the current-state ICT records and the Cloud Migration Technical Finding). A candidate who proposes a Multi-AZ or mirrored database has missed this constraint — probe it directly in questioning: did they find the discovered-limitation record, and did they weigh the only real route to database failover (replacing the accounting product — new licence, full data migration, staff retraining and change management, and the delivery risk) against accepting backup/restore plus cross-Region DR? Proposing a Multi-AZ database without recognising the constraint and making that cost-versus-benefit case is inadequate research and analysis — reflect it in D1, D2 and D4. NOTE: application-tier Multi-AZ (an Auto Scaling group across AZs behind the internal ALB) is correct and expected — do not penalise it; only the database is constrained.</w:t>
+            </w:r>
+          </w:p>
+        </w:tc>
+        <w:tc>
+          <w:tcPr>
+            <w:tcW w:type="dxa" w:w="1934"/>
+          </w:tcPr>
+          <w:p>
+            <w:r>
+              <w:t>Yes        No</w:t>
+            </w:r>
           </w:p>
         </w:tc>
       </w:tr>

</xml_diff>